<commit_message>
docs: record live ZPF verification
Update the ZPF guide and Portuguese report with the live Packet Tracer
checks: securityk9 license, ping results, SSH from PC-C to R2 shown as an
inspected session on R3, and Check Results at 100%. Add the verified PKA
save and link it from the NetAcad collection README.

Co-Authored-By: Claude Opus 5.5 <noreply@anthropic.com>
</commit_message>
<xml_diff>
--- a/packet-tracer/NetAcad/PedroFerreira_2026-10-23_Configurar-ZPF-Relatorio.docx
+++ b/packet-tracer/NetAcad/PedroFerreira_2026-10-23_Configurar-ZPF-Relatorio.docx
@@ -1032,7 +1032,7 @@
     </w:p>
     <w:p>
       <w:r>
-        <w:t>As zonas, o ACL 101, o class map, a policy map e o zone pair foram configurados com os nomes exatos do roteiro.</w:t>
+        <w:t>As zonas, o ACL 101, o class map, a policy map e o zone pair foram configurados com os nomes exatos do roteiro. O pacote de tecnologia securityk9 está ativo (license boot module c1900 technology-package securityk9), requisito para os comandos de ZPF.</w:t>
       </w:r>
     </w:p>
     <w:p>
@@ -1699,7 +1699,7 @@
                 <w:color w:val="000000"/>
                 <w:sz w:val="18"/>
               </w:rPr>
-              <w:t>4/4 replies, 0% loss após o primeiro teste</w:t>
+              <w:t>Ao vivo: 3/4 replies; a única perda foi a resolução ARP</w:t>
             </w:r>
           </w:p>
         </w:tc>
@@ -1785,7 +1785,7 @@
                 <w:color w:val="000000"/>
                 <w:sz w:val="18"/>
               </w:rPr>
-              <w:t>0 replies; requisições expiraram</w:t>
+              <w:t>Ao vivo: 0/4 replies, 100% de perda</w:t>
             </w:r>
           </w:p>
         </w:tc>
@@ -1932,7 +1932,7 @@
                 <w:color w:val="000000"/>
                 <w:sz w:val="18"/>
               </w:rPr>
-              <w:t>Roteiro preparado</w:t>
+              <w:t>Permitido</w:t>
             </w:r>
           </w:p>
         </w:tc>
@@ -1953,7 +1953,7 @@
                 <w:color w:val="000000"/>
                 <w:sz w:val="18"/>
               </w:rPr>
-              <w:t>A ponte enviou o comando, mas a sessão interativa não forneceu saída estável</w:t>
+              <w:t>Login como Admin chegou ao prompt R2#; no R3 a sessão 192.168.3.3:1025 =&gt; 10.2.2.2:22 apareceu como TCP_ESTAB na classe IN-NET-CLASS-MAP</w:t>
             </w:r>
           </w:p>
         </w:tc>
@@ -2035,7 +2035,7 @@
                 <w:color w:val="000000"/>
                 <w:sz w:val="18"/>
               </w:rPr>
-              <w:t>A ponte MCP não abre o navegador gráfico</w:t>
+              <w:t>A ponte MCP não abre o navegador gráfico do PC; teste manual pendente</w:t>
             </w:r>
           </w:p>
         </w:tc>
@@ -2044,7 +2044,7 @@
     <w:p/>
     <w:p>
       <w:r>
-        <w:t>A primeira resposta de ping pode falhar por resolução ARP. O teste interno repetido confirmou 4/4 respostas. As verificações de SSH e HTTP devem ser repetidas pelo usuário na interface gráfica do Packet Tracer para registrar a sessão ativa no comando show policy-map type inspect zone-pair sessions.</w:t>
+        <w:t>Os testes foram refeitos ao vivo pela ponte MCP em 23/10/2026. A primeira resposta de ping pode falhar por resolução ARP. Com o SSH aberto, o comando show policy-map type inspect zone-pair sessions mostrou 1 sessão estabelecida inspecionada pela IN-NET-CLASS-MAP, e a class-default manteve a ação Drop. A sessão SSH foi encerrada após o teste. O HTTP pelo navegador do PC-C ainda deve ser confirmado na interface gráfica.</w:t>
       </w:r>
     </w:p>
     <w:p>
@@ -2283,7 +2283,7 @@
     </w:p>
     <w:p>
       <w:r>
-        <w:t>A política ZPF foi configurada no R3, salva no PKA concluído e documentada com os comandos e testes obtidos. O arquivo original permanece separado na versão base.</w:t>
+        <w:t>A política ZPF foi configurada no R3, salva no PKA concluído e documentada com os comandos e testes obtidos. A verificação ao vivo foi feita no arquivo PedroFerreira_2026-10-23_Configurar-ZPF-concluido.pkt.pka (SHA-256 EF33EB48185C999D56C9F1F29BC9E373AAF09B58A9604768D98BD9ED6D4424A2). Check Results da atividade: 100%. O arquivo original permanece separado na versão base.</w:t>
       </w:r>
     </w:p>
     <w:sectPr>

</xml_diff>